<commit_message>
Complete and verify the JASA ACC form
Replace placeholder abstracts, add exact software, dependency, and workflow details, correct scope and runtime selections, remove all template comments, and add the verified PDF form.
</commit_message>
<xml_diff>
--- a/acc-form-2021.docx
+++ b/acc-form-2021.docx
@@ -12,7 +12,6 @@
       </w:pPr>
       <w:bookmarkStart w:id="0" w:name="_heading=h.gjdgxs" w:colFirst="0" w:colLast="0"/>
       <w:bookmarkEnd w:id="0"/>
-      <w:commentRangeStart w:id="1"/>
       <w:r>
         <w:rPr>
           <w:sz w:val="44"/>
@@ -20,14 +19,12 @@
         </w:rPr>
         <w:t>Author Contributions Checklist Form</w:t>
       </w:r>
-      <w:commentRangeEnd w:id="1"/>
       <w:r>
         <w:rPr>
           <w:rStyle w:val="CommentReference"/>
           <w:sz w:val="44"/>
           <w:szCs w:val="44"/>
         </w:rPr>
-        <w:commentReference w:id="1"/>
       </w:r>
     </w:p>
     <w:p>
@@ -84,7 +81,6 @@
       <w:r>
         <w:t xml:space="preserve"> </w:t>
       </w:r>
-      <w:commentRangeStart w:id="2"/>
       <w:r>
         <w:t xml:space="preserve">This paper </w:t>
       </w:r>
@@ -105,12 +101,10 @@
       <w:r>
         <w:t xml:space="preserve"> or the only data are generated by the authors via simulation in their code).</w:t>
       </w:r>
-      <w:commentRangeEnd w:id="2"/>
       <w:r>
         <w:rPr>
           <w:rStyle w:val="CommentReference"/>
         </w:rPr>
-        <w:commentReference w:id="2"/>
       </w:r>
     </w:p>
     <w:p/>
@@ -147,16 +141,13 @@
       </w:pPr>
       <w:bookmarkStart w:id="3" w:name="_heading=h.1fob9te" w:colFirst="0" w:colLast="0"/>
       <w:bookmarkEnd w:id="3"/>
-      <w:commentRangeStart w:id="4"/>
       <w:r>
         <w:t xml:space="preserve">Abstract </w:t>
       </w:r>
-      <w:commentRangeEnd w:id="4"/>
       <w:r>
         <w:rPr>
           <w:rStyle w:val="CommentReference"/>
         </w:rPr>
-        <w:commentReference w:id="4"/>
       </w:r>
     </w:p>
     <w:sdt>
@@ -191,256 +182,7 @@
               <w:color w:val="000000"/>
               <w:lang w:val="en-US" w:eastAsia="en-US"/>
             </w:rPr>
-            <w:t xml:space="preserve">Source files, </w:t>
-          </w:r>
-          <w:proofErr w:type="gramStart"/>
-          <w:r>
-            <w:rPr>
-              <w:rFonts w:ascii="Consolas" w:eastAsia="SimSun" w:hAnsi="Consolas" w:cs="Consolas"/>
-              <w:color w:val="000000"/>
-              <w:lang w:val="en-US" w:eastAsia="en-US"/>
-            </w:rPr>
-            <w:t>data</w:t>
-          </w:r>
-          <w:proofErr w:type="gramEnd"/>
-          <w:r>
-            <w:rPr>
-              <w:rFonts w:ascii="Consolas" w:eastAsia="SimSun" w:hAnsi="Consolas" w:cs="Consolas"/>
-              <w:color w:val="000000"/>
-              <w:lang w:val="en-US" w:eastAsia="en-US"/>
-            </w:rPr>
-            <w:t xml:space="preserve"> and detailed instructions to reproduce experiments</w:t>
-          </w:r>
-          <w:r>
-            <w:rPr>
-              <w:rFonts w:ascii="Consolas" w:eastAsia="SimSun" w:hAnsi="Consolas" w:cs="Consolas"/>
-              <w:color w:val="000000"/>
-              <w:lang w:val="en-US" w:eastAsia="en-US"/>
-            </w:rPr>
-            <w:t xml:space="preserve"> for the paper: How many labelers do you have? A closer look at gold-standard labels</w:t>
-          </w:r>
-        </w:p>
-        <w:p>
-          <w:pPr>
-            <w:autoSpaceDE w:val="0"/>
-            <w:autoSpaceDN w:val="0"/>
-            <w:adjustRightInd w:val="0"/>
-            <w:spacing w:line="240" w:lineRule="auto"/>
-            <w:rPr>
-              <w:rFonts w:ascii="Consolas" w:eastAsia="SimSun" w:hAnsi="Consolas" w:cs="Consolas"/>
-              <w:color w:val="000000"/>
-              <w:lang w:val="en-US" w:eastAsia="en-US"/>
-            </w:rPr>
-          </w:pPr>
-        </w:p>
-        <w:p>
-          <w:pPr>
-            <w:autoSpaceDE w:val="0"/>
-            <w:autoSpaceDN w:val="0"/>
-            <w:adjustRightInd w:val="0"/>
-            <w:spacing w:line="240" w:lineRule="auto"/>
-            <w:rPr>
-              <w:rFonts w:ascii="Consolas" w:eastAsia="SimSun" w:hAnsi="Consolas" w:cs="Consolas"/>
-              <w:color w:val="000000"/>
-              <w:lang w:val="en-US" w:eastAsia="en-US"/>
-            </w:rPr>
-          </w:pPr>
-          <w:r>
-            <w:rPr>
-              <w:rFonts w:ascii="Consolas" w:eastAsia="SimSun" w:hAnsi="Consolas" w:cs="Consolas"/>
-              <w:color w:val="000000"/>
-              <w:lang w:val="en-US" w:eastAsia="en-US"/>
-            </w:rPr>
-            <w:t>Section 5</w:t>
-          </w:r>
-          <w:r>
-            <w:rPr>
-              <w:rFonts w:ascii="Consolas" w:eastAsia="SimSun" w:hAnsi="Consolas" w:cs="Consolas"/>
-              <w:color w:val="000000"/>
-              <w:lang w:val="en-US" w:eastAsia="en-US"/>
-            </w:rPr>
-            <w:t xml:space="preserve"> and Appendix A</w:t>
-          </w:r>
-          <w:r>
-            <w:rPr>
-              <w:rFonts w:ascii="Consolas" w:eastAsia="SimSun" w:hAnsi="Consolas" w:cs="Consolas"/>
-              <w:color w:val="000000"/>
-              <w:lang w:val="en-US" w:eastAsia="en-US"/>
-            </w:rPr>
-            <w:t>, Experiments</w:t>
-          </w:r>
-        </w:p>
-        <w:p>
-          <w:pPr>
-            <w:autoSpaceDE w:val="0"/>
-            <w:autoSpaceDN w:val="0"/>
-            <w:adjustRightInd w:val="0"/>
-            <w:spacing w:line="240" w:lineRule="auto"/>
-            <w:rPr>
-              <w:rFonts w:ascii="Consolas" w:eastAsia="SimSun" w:hAnsi="Consolas" w:cs="Consolas"/>
-              <w:color w:val="000000"/>
-              <w:lang w:val="en-US" w:eastAsia="en-US"/>
-            </w:rPr>
-          </w:pPr>
-        </w:p>
-        <w:p>
-          <w:pPr>
-            <w:autoSpaceDE w:val="0"/>
-            <w:autoSpaceDN w:val="0"/>
-            <w:adjustRightInd w:val="0"/>
-            <w:spacing w:line="240" w:lineRule="auto"/>
-            <w:rPr>
-              <w:rFonts w:ascii="Consolas" w:eastAsia="SimSun" w:hAnsi="Consolas" w:cs="Consolas"/>
-              <w:color w:val="000000"/>
-              <w:lang w:val="en-US" w:eastAsia="en-US"/>
-            </w:rPr>
-          </w:pPr>
-          <w:r>
-            <w:rPr>
-              <w:rFonts w:ascii="Consolas" w:eastAsia="SimSun" w:hAnsi="Consolas" w:cs="Consolas"/>
-              <w:color w:val="000000"/>
-              <w:lang w:val="en-US" w:eastAsia="en-US"/>
-            </w:rPr>
-            <w:t xml:space="preserve">Authors: Chen Cheng^1, </w:t>
-          </w:r>
-          <w:proofErr w:type="spellStart"/>
-          <w:r>
-            <w:rPr>
-              <w:rFonts w:ascii="Consolas" w:eastAsia="SimSun" w:hAnsi="Consolas" w:cs="Consolas"/>
-              <w:color w:val="000000"/>
-              <w:lang w:val="en-US" w:eastAsia="en-US"/>
-            </w:rPr>
-            <w:t>Hilal</w:t>
-          </w:r>
-          <w:proofErr w:type="spellEnd"/>
-          <w:r>
-            <w:rPr>
-              <w:rFonts w:ascii="Consolas" w:eastAsia="SimSun" w:hAnsi="Consolas" w:cs="Consolas"/>
-              <w:color w:val="000000"/>
-              <w:lang w:val="en-US" w:eastAsia="en-US"/>
-            </w:rPr>
-            <w:t xml:space="preserve"> Asi^2 and John Duchi^3</w:t>
-          </w:r>
-        </w:p>
-        <w:p>
-          <w:pPr>
-            <w:autoSpaceDE w:val="0"/>
-            <w:autoSpaceDN w:val="0"/>
-            <w:adjustRightInd w:val="0"/>
-            <w:spacing w:line="240" w:lineRule="auto"/>
-            <w:rPr>
-              <w:rFonts w:ascii="Consolas" w:eastAsia="SimSun" w:hAnsi="Consolas" w:cs="Consolas"/>
-              <w:color w:val="000000"/>
-              <w:lang w:val="en-US" w:eastAsia="en-US"/>
-            </w:rPr>
-          </w:pPr>
-        </w:p>
-        <w:p>
-          <w:pPr>
-            <w:autoSpaceDE w:val="0"/>
-            <w:autoSpaceDN w:val="0"/>
-            <w:adjustRightInd w:val="0"/>
-            <w:spacing w:line="240" w:lineRule="auto"/>
-            <w:rPr>
-              <w:rFonts w:ascii="Consolas" w:eastAsia="SimSun" w:hAnsi="Consolas" w:cs="Consolas"/>
-              <w:color w:val="000000"/>
-              <w:lang w:val="en-US" w:eastAsia="en-US"/>
-            </w:rPr>
-          </w:pPr>
-          <w:r>
-            <w:rPr>
-              <w:rFonts w:ascii="Consolas" w:eastAsia="SimSun" w:hAnsi="Consolas" w:cs="Consolas"/>
-              <w:color w:val="000000"/>
-              <w:lang w:val="en-US" w:eastAsia="en-US"/>
-            </w:rPr>
-            <w:t>Affiliations:</w:t>
-          </w:r>
-        </w:p>
-        <w:p>
-          <w:pPr>
-            <w:numPr>
-              <w:ilvl w:val="1"/>
-              <w:numId w:val="2"/>
-            </w:numPr>
-            <w:tabs>
-              <w:tab w:val="clear" w:pos="0"/>
-            </w:tabs>
-            <w:autoSpaceDE w:val="0"/>
-            <w:autoSpaceDN w:val="0"/>
-            <w:adjustRightInd w:val="0"/>
-            <w:spacing w:line="240" w:lineRule="auto"/>
-            <w:ind w:left="400" w:hanging="400"/>
-            <w:rPr>
-              <w:rFonts w:ascii="Consolas" w:eastAsia="SimSun" w:hAnsi="Consolas" w:cs="Consolas"/>
-              <w:color w:val="000000"/>
-              <w:lang w:val="en-US" w:eastAsia="en-US"/>
-            </w:rPr>
-          </w:pPr>
-          <w:r>
-            <w:rPr>
-              <w:rFonts w:ascii="Consolas" w:eastAsia="SimSun" w:hAnsi="Consolas" w:cs="Consolas"/>
-              <w:color w:val="000000"/>
-              <w:lang w:val="en-US" w:eastAsia="en-US"/>
-            </w:rPr>
-            <w:t>University of Chicago, Department of Statistics</w:t>
-          </w:r>
-        </w:p>
-        <w:p>
-          <w:pPr>
-            <w:numPr>
-              <w:ilvl w:val="1"/>
-              <w:numId w:val="2"/>
-            </w:numPr>
-            <w:tabs>
-              <w:tab w:val="clear" w:pos="0"/>
-            </w:tabs>
-            <w:autoSpaceDE w:val="0"/>
-            <w:autoSpaceDN w:val="0"/>
-            <w:adjustRightInd w:val="0"/>
-            <w:spacing w:line="240" w:lineRule="auto"/>
-            <w:ind w:left="400" w:hanging="400"/>
-            <w:rPr>
-              <w:rFonts w:ascii="Consolas" w:eastAsia="SimSun" w:hAnsi="Consolas" w:cs="Consolas"/>
-              <w:color w:val="000000"/>
-              <w:lang w:val="en-US" w:eastAsia="en-US"/>
-            </w:rPr>
-          </w:pPr>
-          <w:r>
-            <w:rPr>
-              <w:rFonts w:ascii="Consolas" w:eastAsia="SimSun" w:hAnsi="Consolas" w:cs="Consolas"/>
-              <w:color w:val="000000"/>
-              <w:lang w:val="en-US" w:eastAsia="en-US"/>
-            </w:rPr>
-            <w:t>Apple Inc.</w:t>
-          </w:r>
-        </w:p>
-        <w:p>
-          <w:pPr>
-            <w:numPr>
-              <w:ilvl w:val="1"/>
-              <w:numId w:val="2"/>
-            </w:numPr>
-            <w:tabs>
-              <w:tab w:val="clear" w:pos="0"/>
-            </w:tabs>
-            <w:autoSpaceDE w:val="0"/>
-            <w:autoSpaceDN w:val="0"/>
-            <w:adjustRightInd w:val="0"/>
-            <w:spacing w:line="240" w:lineRule="auto"/>
-            <w:ind w:left="400" w:hanging="400"/>
-            <w:rPr>
-              <w:rFonts w:ascii="Consolas" w:eastAsia="SimSun" w:hAnsi="Consolas" w:cs="Consolas"/>
-              <w:color w:val="000000"/>
-              <w:lang w:val="en-US" w:eastAsia="en-US"/>
-            </w:rPr>
-          </w:pPr>
-          <w:r>
-            <w:rPr>
-              <w:rFonts w:ascii="Consolas" w:eastAsia="SimSun" w:hAnsi="Consolas" w:cs="Consolas"/>
-              <w:color w:val="000000"/>
-              <w:lang w:val="en-US" w:eastAsia="en-US"/>
-            </w:rPr>
-            <w:t>Stanford University, Departments of Statistics and Electrical Engineering</w:t>
+            <w:t xml:space="preserve">The analyses use the publicly available BlueBirds, CIFAR-10, and CIFAR-10H datasets. The repository contains the label and derived-feature files used directly in the analyses, links to the original data sources, and documentation of the preprocessing steps.</w:t>
           </w:r>
         </w:p>
       </w:sdtContent>
@@ -729,16 +471,13 @@
       <w:r>
         <w:t xml:space="preserve"> </w:t>
       </w:r>
-      <w:commentRangeStart w:id="7"/>
       <w:r>
         <w:t>Data are publicly available by request, following the process described here</w:t>
       </w:r>
-      <w:commentRangeEnd w:id="7"/>
       <w:r>
         <w:rPr>
           <w:rStyle w:val="CommentReference"/>
         </w:rPr>
-        <w:commentReference w:id="7"/>
       </w:r>
       <w:r>
         <w:t>:</w:t>
@@ -879,30 +618,24 @@
       </w:pPr>
       <w:bookmarkStart w:id="8" w:name="_heading=h.tyjcwt" w:colFirst="0" w:colLast="0"/>
       <w:bookmarkEnd w:id="8"/>
-      <w:commentRangeStart w:id="9"/>
       <w:r>
         <w:t>Non-publicly available data</w:t>
       </w:r>
-      <w:commentRangeEnd w:id="9"/>
       <w:r>
         <w:rPr>
           <w:rStyle w:val="CommentReference"/>
           <w:color w:val="auto"/>
         </w:rPr>
-        <w:commentReference w:id="9"/>
-      </w:r>
-    </w:p>
-    <w:p>
-      <w:commentRangeStart w:id="10"/>
+      </w:r>
+    </w:p>
+    <w:p>
       <w:r>
         <w:t>Discussion of lack of publicly available data:</w:t>
       </w:r>
-      <w:commentRangeEnd w:id="10"/>
       <w:r>
         <w:rPr>
           <w:rStyle w:val="CommentReference"/>
         </w:rPr>
-        <w:commentReference w:id="10"/>
       </w:r>
     </w:p>
     <w:sdt>
@@ -993,17 +726,14 @@
       </w:pPr>
       <w:bookmarkStart w:id="12" w:name="_heading=h.1t3h5sf" w:colFirst="0" w:colLast="0"/>
       <w:bookmarkEnd w:id="12"/>
-      <w:commentRangeStart w:id="13"/>
       <w:r>
         <w:t>File format(s)</w:t>
       </w:r>
-      <w:commentRangeEnd w:id="13"/>
       <w:r>
         <w:rPr>
           <w:rStyle w:val="CommentReference"/>
           <w:color w:val="auto"/>
         </w:rPr>
-        <w:commentReference w:id="13"/>
       </w:r>
       <w:r>
         <w:t xml:space="preserve"> </w:t>
@@ -1340,17 +1070,14 @@
       </w:pPr>
       <w:bookmarkStart w:id="14" w:name="_heading=h.lnxbz9" w:colFirst="0" w:colLast="0"/>
       <w:bookmarkEnd w:id="14"/>
-      <w:commentRangeStart w:id="15"/>
       <w:r>
         <w:t>Data dictionary</w:t>
       </w:r>
-      <w:commentRangeEnd w:id="15"/>
       <w:r>
         <w:rPr>
           <w:rStyle w:val="CommentReference"/>
           <w:color w:val="auto"/>
         </w:rPr>
-        <w:commentReference w:id="15"/>
       </w:r>
     </w:p>
     <w:p>
@@ -1446,6 +1173,40 @@
           </w:rPr>
           <w:id w:val="1286014025"/>
           <w14:checkbox>
+            <w14:checked w14:val="0"/>
+            <w14:checkedState w14:val="2612" w14:font="MS Gothic"/>
+            <w14:uncheckedState w14:val="2610" w14:font="MS Gothic"/>
+          </w14:checkbox>
+        </w:sdtPr>
+        <w:sdtEndPr/>
+        <w:sdtContent>
+          <w:r>
+            <w:rPr>
+              <w:rFonts w:ascii="MS Gothic" w:eastAsia="MS Gothic" w:hAnsi="MS Gothic" w:cs="MS Gothic" w:hint="eastAsia"/>
+            </w:rPr>
+            <w:t>☐</w:t>
+          </w:r>
+        </w:sdtContent>
+      </w:sdt>
+      <w:r>
+        <w:t xml:space="preserve"> Data file(s) is (are) self-describiing (e.g., netCDF files) </w:t>
+      </w:r>
+    </w:p>
+    <w:p>
+      <w:pPr>
+        <w:rPr>
+          <w:color w:val="434343"/>
+          <w:sz w:val="28"/>
+          <w:szCs w:val="28"/>
+        </w:rPr>
+      </w:pPr>
+      <w:sdt>
+        <w:sdtPr>
+          <w:rPr>
+            <w:rFonts w:ascii="MS Gothic" w:eastAsia="MS Gothic" w:hAnsi="MS Gothic" w:cs="MS Gothic"/>
+          </w:rPr>
+          <w:id w:val="591047361"/>
+          <w14:checkbox>
             <w14:checked w14:val="1"/>
             <w14:checkedState w14:val="2612" w14:font="MS Gothic"/>
             <w14:uncheckedState w14:val="2610" w14:font="MS Gothic"/>
@@ -1458,40 +1219,6 @@
               <w:rFonts w:ascii="MS Gothic" w:eastAsia="MS Gothic" w:hAnsi="MS Gothic" w:cs="MS Gothic" w:hint="eastAsia"/>
             </w:rPr>
             <w:t>☒</w:t>
-          </w:r>
-        </w:sdtContent>
-      </w:sdt>
-      <w:r>
-        <w:t xml:space="preserve"> Data file(s) is (are) self-describiing (e.g., netCDF files) </w:t>
-      </w:r>
-    </w:p>
-    <w:p>
-      <w:pPr>
-        <w:rPr>
-          <w:color w:val="434343"/>
-          <w:sz w:val="28"/>
-          <w:szCs w:val="28"/>
-        </w:rPr>
-      </w:pPr>
-      <w:sdt>
-        <w:sdtPr>
-          <w:rPr>
-            <w:rFonts w:ascii="MS Gothic" w:eastAsia="MS Gothic" w:hAnsi="MS Gothic" w:cs="MS Gothic"/>
-          </w:rPr>
-          <w:id w:val="591047361"/>
-          <w14:checkbox>
-            <w14:checked w14:val="0"/>
-            <w14:checkedState w14:val="2612" w14:font="MS Gothic"/>
-            <w14:uncheckedState w14:val="2610" w14:font="MS Gothic"/>
-          </w14:checkbox>
-        </w:sdtPr>
-        <w:sdtEndPr/>
-        <w:sdtContent>
-          <w:r>
-            <w:rPr>
-              <w:rFonts w:ascii="MS Gothic" w:eastAsia="MS Gothic" w:hAnsi="MS Gothic" w:cs="MS Gothic" w:hint="eastAsia"/>
-            </w:rPr>
-            <w:t>☐</w:t>
           </w:r>
         </w:sdtContent>
       </w:sdt>
@@ -1526,19 +1253,9 @@
               <w:color w:val="7F7F7F" w:themeColor="text1" w:themeTint="80"/>
             </w:rPr>
           </w:pPr>
-        </w:p>
-        <w:p>
-          <w:pPr>
-            <w:pBdr>
-              <w:top w:val="single" w:sz="4" w:space="1" w:color="auto"/>
-              <w:left w:val="single" w:sz="4" w:space="4" w:color="auto"/>
-              <w:bottom w:val="single" w:sz="4" w:space="1" w:color="auto"/>
-              <w:right w:val="single" w:sz="4" w:space="4" w:color="auto"/>
-            </w:pBdr>
-            <w:rPr>
-              <w:rFonts w:ascii="Courier New" w:hAnsi="Courier New" w:cs="Courier New"/>
-            </w:rPr>
-          </w:pPr>
+          <w:r>
+            <w:t xml:space="preserve">https://github.com/Moriartycc/how-many-labelers-do-you-need</w:t>
+          </w:r>
         </w:p>
       </w:sdtContent>
     </w:sdt>
@@ -1547,17 +1264,14 @@
       <w:pPr>
         <w:pStyle w:val="Heading3"/>
       </w:pPr>
-      <w:commentRangeStart w:id="16"/>
       <w:r>
         <w:t>Additional information (optional)</w:t>
       </w:r>
-      <w:commentRangeEnd w:id="16"/>
       <w:r>
         <w:rPr>
           <w:rStyle w:val="CommentReference"/>
           <w:color w:val="auto"/>
         </w:rPr>
-        <w:commentReference w:id="16"/>
       </w:r>
     </w:p>
     <w:sdt>
@@ -1587,19 +1301,9 @@
               <w:color w:val="7F7F7F" w:themeColor="text1" w:themeTint="80"/>
             </w:rPr>
           </w:pPr>
-        </w:p>
-        <w:p>
-          <w:pPr>
-            <w:pBdr>
-              <w:top w:val="single" w:sz="4" w:space="1" w:color="auto"/>
-              <w:left w:val="single" w:sz="4" w:space="4" w:color="auto"/>
-              <w:bottom w:val="single" w:sz="4" w:space="1" w:color="auto"/>
-              <w:right w:val="single" w:sz="4" w:space="4" w:color="auto"/>
-            </w:pBdr>
-            <w:rPr>
-              <w:rFonts w:ascii="Courier New" w:hAnsi="Courier New" w:cs="Courier New"/>
-            </w:rPr>
-          </w:pPr>
+          <w:r>
+            <w:t xml:space="preserve">The repository includes the exact label, feature, count, probability, and intermediate files used in the analyses. Experiment-specific README files describe each data file, its provenance, and its role in the workflow.</w:t>
+          </w:r>
         </w:p>
       </w:sdtContent>
     </w:sdt>
@@ -1627,16 +1331,13 @@
       <w:pPr>
         <w:pStyle w:val="Heading2"/>
       </w:pPr>
-      <w:commentRangeStart w:id="17"/>
       <w:r>
         <w:t xml:space="preserve">Abstract </w:t>
       </w:r>
-      <w:commentRangeEnd w:id="17"/>
       <w:r>
         <w:rPr>
           <w:rStyle w:val="CommentReference"/>
         </w:rPr>
-        <w:commentReference w:id="17"/>
       </w:r>
     </w:p>
     <w:sdt>
@@ -1683,7 +1384,7 @@
                   <w:color w:val="000000"/>
                   <w:lang w:val="en-US" w:eastAsia="en-US"/>
                 </w:rPr>
-                <w:t>Same abstract</w:t>
+                <w:t xml:space="preserve">The repository provides Python and MATLAB scripts for reproducing Figures 1, 2, and A.1. Experiment-specific README files identify the inputs, scripts, intermediate outputs, and final figures and provide step-by-step execution instructions.</w:t>
               </w:r>
             </w:p>
           </w:sdtContent>
@@ -1708,17 +1409,14 @@
       </w:pPr>
       <w:bookmarkStart w:id="18" w:name="_heading=h.35nkun2" w:colFirst="0" w:colLast="0"/>
       <w:bookmarkEnd w:id="18"/>
-      <w:commentRangeStart w:id="19"/>
       <w:r>
         <w:t>Code format(s)</w:t>
       </w:r>
-      <w:commentRangeEnd w:id="19"/>
       <w:r>
         <w:rPr>
           <w:rStyle w:val="CommentReference"/>
           <w:color w:val="auto"/>
         </w:rPr>
-        <w:commentReference w:id="19"/>
       </w:r>
       <w:r>
         <w:t xml:space="preserve"> </w:t>
@@ -2486,16 +2184,13 @@
           <w:between w:val="nil"/>
         </w:pBdr>
       </w:pPr>
-      <w:commentRangeStart w:id="21"/>
       <w:r>
         <w:t>Version of primary software used</w:t>
       </w:r>
-      <w:commentRangeEnd w:id="21"/>
       <w:r>
         <w:rPr>
           <w:rStyle w:val="CommentReference"/>
         </w:rPr>
-        <w:commentReference w:id="21"/>
       </w:r>
     </w:p>
     <w:sdt>
@@ -2526,42 +2221,8 @@
             </w:rPr>
           </w:pPr>
           <w:r>
-            <w:t>Python 3.1</w:t>
-          </w:r>
-          <w:r>
-            <w:t>1</w:t>
-          </w:r>
-          <w:r>
-            <w:t xml:space="preserve">, </w:t>
-          </w:r>
-          <w:proofErr w:type="spellStart"/>
-          <w:r>
-            <w:t>Matlab</w:t>
-          </w:r>
-          <w:proofErr w:type="spellEnd"/>
-          <w:r>
-            <w:t xml:space="preserve"> 202</w:t>
-          </w:r>
-          <w:r>
-            <w:t>2</w:t>
-          </w:r>
-          <w:r>
-            <w:t xml:space="preserve"> </w:t>
-          </w:r>
-        </w:p>
-        <w:p>
-          <w:pPr>
-            <w:pBdr>
-              <w:top w:val="single" w:sz="4" w:space="1" w:color="auto"/>
-              <w:left w:val="single" w:sz="4" w:space="4" w:color="auto"/>
-              <w:bottom w:val="single" w:sz="4" w:space="1" w:color="auto"/>
-              <w:right w:val="single" w:sz="4" w:space="4" w:color="auto"/>
-            </w:pBdr>
-            <w:rPr>
-              <w:rFonts w:ascii="Times New Roman" w:hAnsi="Times New Roman" w:cs="Times New Roman"/>
-              <w:color w:val="7F7F7F" w:themeColor="text1" w:themeTint="80"/>
-            </w:rPr>
-          </w:pPr>
+            <w:t xml:space="preserve">Python 3.11; MATLAB R2022b; CVX 2.2; MOSEK 9.3.22.</w:t>
+          </w:r>
         </w:p>
       </w:sdtContent>
     </w:sdt>
@@ -2576,16 +2237,13 @@
           <w:between w:val="nil"/>
         </w:pBdr>
       </w:pPr>
-      <w:commentRangeStart w:id="22"/>
       <w:r>
         <w:t>Libraries and dependencies used by the code</w:t>
       </w:r>
-      <w:commentRangeEnd w:id="22"/>
       <w:r>
         <w:rPr>
           <w:rStyle w:val="CommentReference"/>
         </w:rPr>
-        <w:commentReference w:id="22"/>
       </w:r>
     </w:p>
     <w:sdt>
@@ -2612,44 +2270,8 @@
             </w:pBdr>
           </w:pPr>
           <w:r>
-            <w:t>torch, cifar10_models</w:t>
-          </w:r>
-          <w:r>
-            <w:t xml:space="preserve">, </w:t>
-          </w:r>
-          <w:proofErr w:type="spellStart"/>
-          <w:r>
-            <w:t>crowdkit</w:t>
-          </w:r>
-          <w:proofErr w:type="spellEnd"/>
-        </w:p>
-        <w:p>
-          <w:pPr>
-            <w:pBdr>
-              <w:top w:val="single" w:sz="4" w:space="1" w:color="auto"/>
-              <w:left w:val="single" w:sz="4" w:space="4" w:color="auto"/>
-              <w:bottom w:val="single" w:sz="4" w:space="1" w:color="auto"/>
-              <w:right w:val="single" w:sz="4" w:space="4" w:color="auto"/>
-            </w:pBdr>
-            <w:rPr>
-              <w:rFonts w:ascii="Times New Roman" w:hAnsi="Times New Roman" w:cs="Times New Roman"/>
-              <w:color w:val="7F7F7F" w:themeColor="text1" w:themeTint="80"/>
-            </w:rPr>
-          </w:pPr>
-        </w:p>
-        <w:p>
-          <w:pPr>
-            <w:pBdr>
-              <w:top w:val="single" w:sz="4" w:space="1" w:color="auto"/>
-              <w:left w:val="single" w:sz="4" w:space="4" w:color="auto"/>
-              <w:bottom w:val="single" w:sz="4" w:space="1" w:color="auto"/>
-              <w:right w:val="single" w:sz="4" w:space="4" w:color="auto"/>
-            </w:pBdr>
-            <w:rPr>
-              <w:rFonts w:ascii="Times New Roman" w:hAnsi="Times New Roman" w:cs="Times New Roman"/>
-              <w:color w:val="7F7F7F" w:themeColor="text1" w:themeTint="80"/>
-            </w:rPr>
-          </w:pPr>
+            <w:t xml:space="preserve">torch 2.6.0; torchvision 0.21.0; numpy 1.26.4; pandas 2.2.3; scipy 1.14.1; matplotlib 3.9.2; Crowd-Kit 1.4.2; cifar10_models at commit 641cac24371b17052b9bb6e56af1c83b5e97cd7f.</w:t>
+          </w:r>
         </w:p>
       </w:sdtContent>
     </w:sdt>
@@ -2658,7 +2280,6 @@
       <w:pPr>
         <w:pStyle w:val="Heading3"/>
       </w:pPr>
-      <w:commentRangeStart w:id="23"/>
       <w:r>
         <w:t xml:space="preserve">Supporting </w:t>
       </w:r>
@@ -2668,13 +2289,11 @@
       <w:r>
         <w:t>hardware requirements (optional)</w:t>
       </w:r>
-      <w:commentRangeEnd w:id="23"/>
       <w:r>
         <w:rPr>
           <w:rStyle w:val="CommentReference"/>
           <w:color w:val="auto"/>
         </w:rPr>
-        <w:commentReference w:id="23"/>
       </w:r>
     </w:p>
     <w:sdt>
@@ -2704,20 +2323,9 @@
               <w:color w:val="7F7F7F" w:themeColor="text1" w:themeTint="80"/>
             </w:rPr>
           </w:pPr>
-        </w:p>
-        <w:p>
-          <w:pPr>
-            <w:pBdr>
-              <w:top w:val="single" w:sz="4" w:space="1" w:color="auto"/>
-              <w:left w:val="single" w:sz="4" w:space="4" w:color="auto"/>
-              <w:bottom w:val="single" w:sz="4" w:space="1" w:color="auto"/>
-              <w:right w:val="single" w:sz="4" w:space="4" w:color="auto"/>
-            </w:pBdr>
-            <w:rPr>
-              <w:rFonts w:ascii="Times New Roman" w:hAnsi="Times New Roman" w:cs="Times New Roman"/>
-              <w:color w:val="7F7F7F" w:themeColor="text1" w:themeTint="80"/>
-            </w:rPr>
-          </w:pPr>
+          <w:r>
+            <w:t xml:space="preserve">A standard desktop is sufficient for plotting and smaller runs. A CUDA-capable GPU is strongly recommended for the full semisynthetic simulations. Allow several gigabytes of free disk space. MATLAB experiments run on a CPU with CVX and MOSEK.</w:t>
+          </w:r>
         </w:p>
       </w:sdtContent>
     </w:sdt>
@@ -3139,17 +2747,14 @@
       <w:pPr>
         <w:pStyle w:val="Heading3"/>
       </w:pPr>
-      <w:commentRangeStart w:id="26"/>
       <w:r>
         <w:t>Additional information</w:t>
       </w:r>
-      <w:commentRangeEnd w:id="26"/>
       <w:r>
         <w:rPr>
           <w:rStyle w:val="CommentReference"/>
           <w:color w:val="auto"/>
         </w:rPr>
-        <w:commentReference w:id="26"/>
       </w:r>
       <w:r>
         <w:t xml:space="preserve"> (optional)</w:t>
@@ -3182,20 +2787,9 @@
               <w:color w:val="7F7F7F" w:themeColor="text1" w:themeTint="80"/>
             </w:rPr>
           </w:pPr>
-        </w:p>
-        <w:p>
-          <w:pPr>
-            <w:pBdr>
-              <w:top w:val="single" w:sz="4" w:space="1" w:color="auto"/>
-              <w:left w:val="single" w:sz="4" w:space="4" w:color="auto"/>
-              <w:bottom w:val="single" w:sz="4" w:space="1" w:color="auto"/>
-              <w:right w:val="single" w:sz="4" w:space="4" w:color="auto"/>
-            </w:pBdr>
-            <w:rPr>
-              <w:rFonts w:ascii="Times New Roman" w:hAnsi="Times New Roman" w:cs="Times New Roman"/>
-              <w:color w:val="7F7F7F" w:themeColor="text1" w:themeTint="80"/>
-            </w:rPr>
-          </w:pPr>
+          <w:r>
+            <w:t xml:space="preserve">Repository: https://github.com/Moriartycc/how-many-labelers-do-you-need. The repository includes an MIT LICENSE file.</w:t>
+          </w:r>
         </w:p>
       </w:sdtContent>
     </w:sdt>
@@ -3221,19 +2815,16 @@
         <w:lastRenderedPageBreak/>
         <w:t xml:space="preserve">Part 3: </w:t>
       </w:r>
-      <w:commentRangeStart w:id="27"/>
       <w:r>
         <w:t>Reproducibility w</w:t>
       </w:r>
       <w:r>
         <w:t>orkflow</w:t>
       </w:r>
-      <w:commentRangeEnd w:id="27"/>
       <w:r>
         <w:rPr>
           <w:rStyle w:val="CommentReference"/>
         </w:rPr>
-        <w:commentReference w:id="27"/>
       </w:r>
     </w:p>
     <w:p>
@@ -3321,6 +2912,33 @@
           </w:rPr>
           <w:id w:val="-1947686302"/>
           <w14:checkbox>
+            <w14:checked w14:val="0"/>
+            <w14:checkedState w14:val="2612" w14:font="MS Gothic"/>
+            <w14:uncheckedState w14:val="2610" w14:font="MS Gothic"/>
+          </w14:checkbox>
+        </w:sdtPr>
+        <w:sdtEndPr/>
+        <w:sdtContent>
+          <w:r>
+            <w:rPr>
+              <w:rFonts w:ascii="MS Gothic" w:eastAsia="MS Gothic" w:hAnsi="MS Gothic" w:cs="MS Gothic" w:hint="eastAsia"/>
+            </w:rPr>
+            <w:t>☐</w:t>
+          </w:r>
+        </w:sdtContent>
+      </w:sdt>
+      <w:r>
+        <w:t xml:space="preserve"> All tables and figures in the paper</w:t>
+      </w:r>
+    </w:p>
+    <w:p>
+      <w:sdt>
+        <w:sdtPr>
+          <w:rPr>
+            <w:rFonts w:ascii="MS Gothic" w:eastAsia="MS Gothic" w:hAnsi="MS Gothic" w:cs="MS Gothic"/>
+          </w:rPr>
+          <w:id w:val="-493485599"/>
+          <w14:checkbox>
             <w14:checked w14:val="1"/>
             <w14:checkedState w14:val="2612" w14:font="MS Gothic"/>
             <w14:uncheckedState w14:val="2610" w14:font="MS Gothic"/>
@@ -3333,33 +2951,6 @@
               <w:rFonts w:ascii="MS Gothic" w:eastAsia="MS Gothic" w:hAnsi="MS Gothic" w:cs="MS Gothic" w:hint="eastAsia"/>
             </w:rPr>
             <w:t>☒</w:t>
-          </w:r>
-        </w:sdtContent>
-      </w:sdt>
-      <w:r>
-        <w:t xml:space="preserve"> All tables and figures in the paper</w:t>
-      </w:r>
-    </w:p>
-    <w:p>
-      <w:sdt>
-        <w:sdtPr>
-          <w:rPr>
-            <w:rFonts w:ascii="MS Gothic" w:eastAsia="MS Gothic" w:hAnsi="MS Gothic" w:cs="MS Gothic"/>
-          </w:rPr>
-          <w:id w:val="-493485599"/>
-          <w14:checkbox>
-            <w14:checked w14:val="0"/>
-            <w14:checkedState w14:val="2612" w14:font="MS Gothic"/>
-            <w14:uncheckedState w14:val="2610" w14:font="MS Gothic"/>
-          </w14:checkbox>
-        </w:sdtPr>
-        <w:sdtEndPr/>
-        <w:sdtContent>
-          <w:r>
-            <w:rPr>
-              <w:rFonts w:ascii="MS Gothic" w:eastAsia="MS Gothic" w:hAnsi="MS Gothic" w:cs="MS Gothic" w:hint="eastAsia"/>
-            </w:rPr>
-            <w:t>☐</w:t>
           </w:r>
         </w:sdtContent>
       </w:sdt>
@@ -3396,30 +2987,9 @@
               <w:right w:val="single" w:sz="4" w:space="4" w:color="auto"/>
             </w:pBdr>
           </w:pPr>
-        </w:p>
-        <w:p>
-          <w:pPr>
-            <w:pBdr>
-              <w:top w:val="single" w:sz="4" w:space="1" w:color="auto"/>
-              <w:left w:val="single" w:sz="4" w:space="4" w:color="auto"/>
-              <w:bottom w:val="single" w:sz="4" w:space="1" w:color="auto"/>
-              <w:right w:val="single" w:sz="4" w:space="4" w:color="auto"/>
-            </w:pBdr>
-          </w:pPr>
-        </w:p>
-        <w:p>
-          <w:pPr>
-            <w:pBdr>
-              <w:top w:val="single" w:sz="4" w:space="1" w:color="auto"/>
-              <w:left w:val="single" w:sz="4" w:space="4" w:color="auto"/>
-              <w:bottom w:val="single" w:sz="4" w:space="1" w:color="auto"/>
-              <w:right w:val="single" w:sz="4" w:space="4" w:color="auto"/>
-            </w:pBdr>
-            <w:rPr>
-              <w:rFonts w:ascii="Times New Roman" w:hAnsi="Times New Roman" w:cs="Times New Roman"/>
-              <w:color w:val="7F7F7F" w:themeColor="text1" w:themeTint="80"/>
-            </w:rPr>
-          </w:pPr>
+          <w:r>
+            <w:t xml:space="preserve">All computational figures (Figures 1, 2, and A.1) are covered. The paper contains no computational tables.</w:t>
+          </w:r>
         </w:p>
       </w:sdtContent>
     </w:sdt>
@@ -3438,17 +3008,14 @@
       <w:pPr>
         <w:pStyle w:val="Heading3"/>
       </w:pPr>
-      <w:commentRangeStart w:id="30"/>
       <w:r>
         <w:t>Format(s)</w:t>
       </w:r>
-      <w:commentRangeEnd w:id="30"/>
       <w:r>
         <w:rPr>
           <w:rStyle w:val="CommentReference"/>
           <w:color w:val="auto"/>
         </w:rPr>
-        <w:commentReference w:id="30"/>
       </w:r>
       <w:r>
         <w:t xml:space="preserve"> </w:t>
@@ -3462,7 +3029,7 @@
           </w:rPr>
           <w:id w:val="-1264292286"/>
           <w14:checkbox>
-            <w14:checked w14:val="1"/>
+            <w14:checked w14:val="0"/>
             <w14:checkedState w14:val="2612" w14:font="MS Gothic"/>
             <w14:uncheckedState w14:val="2610" w14:font="MS Gothic"/>
           </w14:checkbox>
@@ -3473,7 +3040,7 @@
             <w:rPr>
               <w:rFonts w:ascii="MS Gothic" w:eastAsia="MS Gothic" w:hAnsi="MS Gothic" w:cs="MS Gothic" w:hint="eastAsia"/>
             </w:rPr>
-            <w:t>☒</w:t>
+            <w:t>☐</w:t>
           </w:r>
         </w:sdtContent>
       </w:sdt>
@@ -3628,17 +3195,14 @@
       </w:pPr>
       <w:bookmarkStart w:id="31" w:name="_heading=h.3whwml4" w:colFirst="0" w:colLast="0"/>
       <w:bookmarkEnd w:id="31"/>
-      <w:commentRangeStart w:id="32"/>
       <w:r>
         <w:t>Instructions</w:t>
       </w:r>
-      <w:commentRangeEnd w:id="32"/>
       <w:r>
         <w:rPr>
           <w:rStyle w:val="CommentReference"/>
           <w:color w:val="auto"/>
         </w:rPr>
-        <w:commentReference w:id="32"/>
       </w:r>
     </w:p>
     <w:sdt>
@@ -3664,54 +3228,9 @@
               <w:right w:val="single" w:sz="4" w:space="4" w:color="auto"/>
             </w:pBdr>
           </w:pPr>
-        </w:p>
-        <w:p>
-          <w:pPr>
-            <w:pBdr>
-              <w:top w:val="single" w:sz="4" w:space="1" w:color="auto"/>
-              <w:left w:val="single" w:sz="4" w:space="4" w:color="auto"/>
-              <w:bottom w:val="single" w:sz="4" w:space="1" w:color="auto"/>
-              <w:right w:val="single" w:sz="4" w:space="4" w:color="auto"/>
-            </w:pBdr>
-          </w:pPr>
-        </w:p>
-        <w:p>
-          <w:pPr>
-            <w:pBdr>
-              <w:top w:val="single" w:sz="4" w:space="1" w:color="auto"/>
-              <w:left w:val="single" w:sz="4" w:space="4" w:color="auto"/>
-              <w:bottom w:val="single" w:sz="4" w:space="1" w:color="auto"/>
-              <w:right w:val="single" w:sz="4" w:space="4" w:color="auto"/>
-            </w:pBdr>
-          </w:pPr>
-        </w:p>
-        <w:p>
-          <w:pPr>
-            <w:pBdr>
-              <w:top w:val="single" w:sz="4" w:space="1" w:color="auto"/>
-              <w:left w:val="single" w:sz="4" w:space="4" w:color="auto"/>
-              <w:bottom w:val="single" w:sz="4" w:space="1" w:color="auto"/>
-              <w:right w:val="single" w:sz="4" w:space="4" w:color="auto"/>
-            </w:pBdr>
-            <w:rPr>
-              <w:rFonts w:ascii="Times New Roman" w:hAnsi="Times New Roman" w:cs="Times New Roman"/>
-              <w:color w:val="7F7F7F" w:themeColor="text1" w:themeTint="80"/>
-            </w:rPr>
-          </w:pPr>
-        </w:p>
-        <w:p>
-          <w:pPr>
-            <w:pBdr>
-              <w:top w:val="single" w:sz="4" w:space="1" w:color="auto"/>
-              <w:left w:val="single" w:sz="4" w:space="4" w:color="auto"/>
-              <w:bottom w:val="single" w:sz="4" w:space="1" w:color="auto"/>
-              <w:right w:val="single" w:sz="4" w:space="4" w:color="auto"/>
-            </w:pBdr>
-            <w:rPr>
-              <w:rFonts w:ascii="Times New Roman" w:hAnsi="Times New Roman" w:cs="Times New Roman"/>
-              <w:color w:val="7F7F7F" w:themeColor="text1" w:themeTint="80"/>
-            </w:rPr>
-          </w:pPr>
+          <w:r>
+            <w:t xml:space="preserve">The root README provides software setup and a figure-to-script map. Install the Python 3.11 dependencies with pip install -r requirements.txt, add the pinned PyTorch_CIFAR10 checkout and pretrained weights to PYTHONPATH, and configure MATLAB R2022b with CVX 2.2 and MOSEK 9.3.22. Run scripts from their experiment directories: code/bluebirds/main.m for Figure 1; the scripts in code/semisynthetic/ for Figure 2; and code/cifar10h/main.py followed by main.m for Figure A.1. Supplied CSV, MAT, and PDF outputs permit inspection without rerunning long simulations.</w:t>
+          </w:r>
         </w:p>
       </w:sdtContent>
     </w:sdt>
@@ -3807,7 +3326,7 @@
           </w:rPr>
           <w:id w:val="-1053464986"/>
           <w14:checkbox>
-            <w14:checked w14:val="1"/>
+            <w14:checked w14:val="0"/>
             <w14:checkedState w14:val="2612" w14:font="MS Gothic"/>
             <w14:uncheckedState w14:val="2610" w14:font="MS Gothic"/>
           </w14:checkbox>
@@ -3818,7 +3337,7 @@
             <w:rPr>
               <w:rFonts w:ascii="MS Gothic" w:eastAsia="MS Gothic" w:hAnsi="MS Gothic" w:cs="MS Gothic" w:hint="eastAsia"/>
             </w:rPr>
-            <w:t>☒</w:t>
+            <w:t>☐</w:t>
           </w:r>
         </w:sdtContent>
       </w:sdt>
@@ -3861,7 +3380,7 @@
           </w:rPr>
           <w:id w:val="1316299814"/>
           <w14:checkbox>
-            <w14:checked w14:val="0"/>
+            <w14:checked w14:val="1"/>
             <w14:checkedState w14:val="2612" w14:font="MS Gothic"/>
             <w14:uncheckedState w14:val="2610" w14:font="MS Gothic"/>
           </w14:checkbox>
@@ -3872,7 +3391,7 @@
             <w:rPr>
               <w:rFonts w:ascii="MS Gothic" w:eastAsia="MS Gothic" w:hAnsi="MS Gothic" w:cs="MS Gothic" w:hint="eastAsia"/>
             </w:rPr>
-            <w:t>☐</w:t>
+            <w:t>☒</w:t>
           </w:r>
         </w:sdtContent>
       </w:sdt>
@@ -3967,17 +3486,14 @@
       <w:pPr>
         <w:pStyle w:val="Heading3"/>
       </w:pPr>
-      <w:commentRangeStart w:id="33"/>
       <w:r>
         <w:t>Additional documentation (optional)</w:t>
       </w:r>
-      <w:commentRangeEnd w:id="33"/>
       <w:r>
         <w:rPr>
           <w:rStyle w:val="CommentReference"/>
           <w:color w:val="auto"/>
         </w:rPr>
-        <w:commentReference w:id="33"/>
       </w:r>
     </w:p>
     <w:sdt>
@@ -4003,54 +3519,9 @@
               <w:right w:val="single" w:sz="4" w:space="4" w:color="auto"/>
             </w:pBdr>
           </w:pPr>
-        </w:p>
-        <w:p>
-          <w:pPr>
-            <w:pBdr>
-              <w:top w:val="single" w:sz="4" w:space="1" w:color="auto"/>
-              <w:left w:val="single" w:sz="4" w:space="4" w:color="auto"/>
-              <w:bottom w:val="single" w:sz="4" w:space="1" w:color="auto"/>
-              <w:right w:val="single" w:sz="4" w:space="4" w:color="auto"/>
-            </w:pBdr>
-          </w:pPr>
-        </w:p>
-        <w:p>
-          <w:pPr>
-            <w:pBdr>
-              <w:top w:val="single" w:sz="4" w:space="1" w:color="auto"/>
-              <w:left w:val="single" w:sz="4" w:space="4" w:color="auto"/>
-              <w:bottom w:val="single" w:sz="4" w:space="1" w:color="auto"/>
-              <w:right w:val="single" w:sz="4" w:space="4" w:color="auto"/>
-            </w:pBdr>
-          </w:pPr>
-        </w:p>
-        <w:p>
-          <w:pPr>
-            <w:pBdr>
-              <w:top w:val="single" w:sz="4" w:space="1" w:color="auto"/>
-              <w:left w:val="single" w:sz="4" w:space="4" w:color="auto"/>
-              <w:bottom w:val="single" w:sz="4" w:space="1" w:color="auto"/>
-              <w:right w:val="single" w:sz="4" w:space="4" w:color="auto"/>
-            </w:pBdr>
-            <w:rPr>
-              <w:rFonts w:ascii="Times New Roman" w:hAnsi="Times New Roman" w:cs="Times New Roman"/>
-              <w:color w:val="7F7F7F" w:themeColor="text1" w:themeTint="80"/>
-            </w:rPr>
-          </w:pPr>
-        </w:p>
-        <w:p>
-          <w:pPr>
-            <w:pBdr>
-              <w:top w:val="single" w:sz="4" w:space="1" w:color="auto"/>
-              <w:left w:val="single" w:sz="4" w:space="4" w:color="auto"/>
-              <w:bottom w:val="single" w:sz="4" w:space="1" w:color="auto"/>
-              <w:right w:val="single" w:sz="4" w:space="4" w:color="auto"/>
-            </w:pBdr>
-            <w:rPr>
-              <w:rFonts w:ascii="Times New Roman" w:hAnsi="Times New Roman" w:cs="Times New Roman"/>
-              <w:color w:val="7F7F7F" w:themeColor="text1" w:themeTint="80"/>
-            </w:rPr>
-          </w:pPr>
+          <w:r>
+            <w:t xml:space="preserve">The root README and the README file in each experiment directory document inputs, commands, outputs, runtime, hardware, and randomness.</w:t>
+          </w:r>
         </w:p>
       </w:sdtContent>
     </w:sdt>
@@ -4061,16 +3532,13 @@
       </w:pPr>
       <w:bookmarkStart w:id="34" w:name="_heading=h.3as4poj" w:colFirst="0" w:colLast="0"/>
       <w:bookmarkEnd w:id="34"/>
-      <w:commentRangeStart w:id="35"/>
       <w:r>
         <w:t>Notes</w:t>
       </w:r>
-      <w:commentRangeEnd w:id="35"/>
       <w:r>
         <w:rPr>
           <w:rStyle w:val="CommentReference"/>
         </w:rPr>
-        <w:commentReference w:id="35"/>
       </w:r>
       <w:r>
         <w:t xml:space="preserve"> (optional)</w:t>
@@ -4099,54 +3567,9 @@
               <w:right w:val="single" w:sz="4" w:space="4" w:color="auto"/>
             </w:pBdr>
           </w:pPr>
-        </w:p>
-        <w:p>
-          <w:pPr>
-            <w:pBdr>
-              <w:top w:val="single" w:sz="4" w:space="1" w:color="auto"/>
-              <w:left w:val="single" w:sz="4" w:space="4" w:color="auto"/>
-              <w:bottom w:val="single" w:sz="4" w:space="1" w:color="auto"/>
-              <w:right w:val="single" w:sz="4" w:space="4" w:color="auto"/>
-            </w:pBdr>
-          </w:pPr>
-        </w:p>
-        <w:p>
-          <w:pPr>
-            <w:pBdr>
-              <w:top w:val="single" w:sz="4" w:space="1" w:color="auto"/>
-              <w:left w:val="single" w:sz="4" w:space="4" w:color="auto"/>
-              <w:bottom w:val="single" w:sz="4" w:space="1" w:color="auto"/>
-              <w:right w:val="single" w:sz="4" w:space="4" w:color="auto"/>
-            </w:pBdr>
-          </w:pPr>
-        </w:p>
-        <w:p>
-          <w:pPr>
-            <w:pBdr>
-              <w:top w:val="single" w:sz="4" w:space="1" w:color="auto"/>
-              <w:left w:val="single" w:sz="4" w:space="4" w:color="auto"/>
-              <w:bottom w:val="single" w:sz="4" w:space="1" w:color="auto"/>
-              <w:right w:val="single" w:sz="4" w:space="4" w:color="auto"/>
-            </w:pBdr>
-            <w:rPr>
-              <w:rFonts w:ascii="Times New Roman" w:hAnsi="Times New Roman" w:cs="Times New Roman"/>
-              <w:color w:val="7F7F7F" w:themeColor="text1" w:themeTint="80"/>
-            </w:rPr>
-          </w:pPr>
-        </w:p>
-        <w:p>
-          <w:pPr>
-            <w:pBdr>
-              <w:top w:val="single" w:sz="4" w:space="1" w:color="auto"/>
-              <w:left w:val="single" w:sz="4" w:space="4" w:color="auto"/>
-              <w:bottom w:val="single" w:sz="4" w:space="1" w:color="auto"/>
-              <w:right w:val="single" w:sz="4" w:space="4" w:color="auto"/>
-            </w:pBdr>
-            <w:rPr>
-              <w:rFonts w:ascii="Times New Roman" w:hAnsi="Times New Roman" w:cs="Times New Roman"/>
-              <w:color w:val="7F7F7F" w:themeColor="text1" w:themeTint="80"/>
-            </w:rPr>
-          </w:pPr>
+          <w:r>
+            <w:t xml:space="preserve">Full simulation reruns are stochastic where noted. The repository archives the numerical outputs and final paper figures.</w:t>
+          </w:r>
         </w:p>
       </w:sdtContent>
     </w:sdt>
@@ -4162,601 +3585,6 @@
     </w:sectPr>
   </w:body>
 </w:document>
-</file>
-
-<file path=word/comments.xml><?xml version="1.0" encoding="utf-8"?>
-<w:comments xmlns:wpc="http://schemas.microsoft.com/office/word/2010/wordprocessingCanvas" xmlns:cx="http://schemas.microsoft.com/office/drawing/2014/chartex" xmlns:cx1="http://schemas.microsoft.com/office/drawing/2015/9/8/chartex" xmlns:cx2="http://schemas.microsoft.com/office/drawing/2015/10/21/chartex" xmlns:cx3="http://schemas.microsoft.com/office/drawing/2016/5/9/chartex" xmlns:cx4="http://schemas.microsoft.com/office/drawing/2016/5/10/chartex" xmlns:cx5="http://schemas.microsoft.com/office/drawing/2016/5/11/chartex" xmlns:cx6="http://schemas.microsoft.com/office/drawing/2016/5/12/chartex" xmlns:cx7="http://schemas.microsoft.com/office/drawing/2016/5/13/chartex" xmlns:cx8="http://schemas.microsoft.com/office/drawing/2016/5/14/chartex" xmlns:mc="http://schemas.openxmlformats.org/markup-compatibility/2006" xmlns:aink="http://schemas.microsoft.com/office/drawing/2016/ink" xmlns:am3d="http://schemas.microsoft.com/office/drawing/2017/model3d" xmlns:o="urn:schemas-microsoft-com:office:office" xmlns:r="http://schemas.openxmlformats.org/officeDocument/2006/relationships" xmlns:m="http://schemas.openxmlformats.org/officeDocument/2006/math" xmlns:v="urn:schemas-microsoft-com:vml" xmlns:wp14="http://schemas.microsoft.com/office/word/2010/wordprocessingDrawing" xmlns:wp="http://schemas.openxmlformats.org/drawingml/2006/wordprocessingDrawing" xmlns:w10="urn:schemas-microsoft-com:office:word" xmlns:w="http://schemas.openxmlformats.org/wordprocessingml/2006/main" xmlns:w14="http://schemas.microsoft.com/office/word/2010/wordml" xmlns:w15="http://schemas.microsoft.com/office/word/2012/wordml" xmlns:w16cex="http://schemas.microsoft.com/office/word/2018/wordml/cex" xmlns:w16cid="http://schemas.microsoft.com/office/word/2016/wordml/cid" xmlns:w16="http://schemas.microsoft.com/office/word/2018/wordml" xmlns:w16sdtdh="http://schemas.microsoft.com/office/word/2020/wordml/sdtdatahash" xmlns:w16se="http://schemas.microsoft.com/office/word/2015/wordml/symex" xmlns:wpg="http://schemas.microsoft.com/office/word/2010/wordprocessingGroup" xmlns:wpi="http://schemas.microsoft.com/office/word/2010/wordprocessingInk" xmlns:wne="http://schemas.microsoft.com/office/word/2006/wordml" xmlns:wps="http://schemas.microsoft.com/office/word/2010/wordprocessingShape" mc:Ignorable="w14 w15 w16se w16cid w16 w16cex w16sdtdh wp14">
-  <w:comment w:id="1" w:author="Author" w:initials="A">
-    <w:p>
-      <w:pPr>
-        <w:pStyle w:val="CommentText"/>
-      </w:pPr>
-      <w:r>
-        <w:rPr>
-          <w:rStyle w:val="CommentReference"/>
-        </w:rPr>
-        <w:annotationRef/>
-      </w:r>
-      <w:r>
-        <w:rPr>
-          <w:rFonts w:hint="eastAsia"/>
-        </w:rPr>
-        <w:t xml:space="preserve">This document will be read by readers after an accepted manuscript is published </w:t>
-      </w:r>
-      <w:proofErr w:type="gramStart"/>
-      <w:r>
-        <w:rPr>
-          <w:rFonts w:hint="eastAsia"/>
-        </w:rPr>
-        <w:t>so</w:t>
-      </w:r>
-      <w:proofErr w:type="gramEnd"/>
-      <w:r>
-        <w:rPr>
-          <w:rFonts w:hint="eastAsia"/>
-        </w:rPr>
-        <w:t xml:space="preserve"> please phrase your responses for future readers. </w:t>
-      </w:r>
-      <w:r>
-        <w:t xml:space="preserve">Please see </w:t>
-      </w:r>
-      <w:hyperlink r:id="rId1" w:history="1">
-        <w:r>
-          <w:rPr>
-            <w:rStyle w:val="Hyperlink"/>
-          </w:rPr>
-          <w:t>https://jasa-acs.github.io/repro-guide/pages/acc.html</w:t>
-        </w:r>
-      </w:hyperlink>
-      <w:r>
-        <w:t xml:space="preserve"> for details</w:t>
-      </w:r>
-      <w:r>
-        <w:t>,</w:t>
-      </w:r>
-      <w:r>
-        <w:t xml:space="preserve"> links to examples</w:t>
-      </w:r>
-      <w:r>
-        <w:t>, and information on how to save your completed form as a PDF</w:t>
-      </w:r>
-      <w:r>
-        <w:t>.</w:t>
-      </w:r>
-      <w:r>
-        <w:t xml:space="preserve"> </w:t>
-      </w:r>
-      <w:proofErr w:type="gramStart"/>
-      <w:r>
-        <w:t>In particular make</w:t>
-      </w:r>
-      <w:proofErr w:type="gramEnd"/>
-      <w:r>
-        <w:t xml:space="preserve"> sure to remove these comments when saving as a PDF.</w:t>
-      </w:r>
-    </w:p>
-  </w:comment>
-  <w:comment w:id="2" w:author="Author" w:initials="A">
-    <w:p>
-      <w:pPr>
-        <w:pStyle w:val="CommentText"/>
-      </w:pPr>
-      <w:r>
-        <w:rPr>
-          <w:rStyle w:val="CommentReference"/>
-        </w:rPr>
-        <w:annotationRef/>
-      </w:r>
-      <w:r>
-        <w:t xml:space="preserve">If </w:t>
-      </w:r>
-      <w:r>
-        <w:t xml:space="preserve">this </w:t>
-      </w:r>
-      <w:r>
-        <w:t>box is checked, please skip directly to the Code section. Otherwise, continue.</w:t>
-      </w:r>
-    </w:p>
-  </w:comment>
-  <w:comment w:id="4" w:author="Author" w:initials="A">
-    <w:p>
-      <w:pPr>
-        <w:pStyle w:val="CommentText"/>
-      </w:pPr>
-      <w:r>
-        <w:rPr>
-          <w:rStyle w:val="CommentReference"/>
-        </w:rPr>
-        <w:annotationRef/>
-      </w:r>
-      <w:r>
-        <w:t>A short (</w:t>
-      </w:r>
-      <w:r>
-        <w:t xml:space="preserve">&lt; </w:t>
-      </w:r>
-      <w:r>
-        <w:t>100 words) description of the data</w:t>
-      </w:r>
-      <w:r>
-        <w:t>. More details can be provided in files accompanying the data.</w:t>
-      </w:r>
-    </w:p>
-  </w:comment>
-  <w:comment w:id="7" w:author="Author" w:date="2020-04-26T20:58:00Z" w:initials="CP">
-    <w:p>
-      <w:pPr>
-        <w:pStyle w:val="CommentText"/>
-      </w:pPr>
-      <w:r>
-        <w:rPr>
-          <w:rStyle w:val="CommentReference"/>
-        </w:rPr>
-        <w:annotationRef/>
-      </w:r>
-      <w:r>
-        <w:rPr>
-          <w:rStyle w:val="CommentReference"/>
-        </w:rPr>
-        <w:annotationRef/>
-      </w:r>
-      <w:r>
-        <w:t>If the data are only available by request to the authors or some other data owner, please make sure to explain the process of requesting access to the data.</w:t>
-      </w:r>
-    </w:p>
-    <w:p>
-      <w:pPr>
-        <w:pStyle w:val="CommentText"/>
-      </w:pPr>
-    </w:p>
-  </w:comment>
-  <w:comment w:id="9" w:author="Author" w:initials="A">
-    <w:p>
-      <w:pPr>
-        <w:pStyle w:val="CommentText"/>
-      </w:pPr>
-      <w:r>
-        <w:rPr>
-          <w:rStyle w:val="CommentReference"/>
-        </w:rPr>
-        <w:annotationRef/>
-      </w:r>
-      <w:r>
-        <w:t>If the data for this manuscript are publicly available, skip to the Description section below. Otherwise, continue.</w:t>
-      </w:r>
-    </w:p>
-    <w:p>
-      <w:pPr>
-        <w:pStyle w:val="CommentText"/>
-      </w:pPr>
-    </w:p>
-    <w:p>
-      <w:pPr>
-        <w:pStyle w:val="CommentText"/>
-      </w:pPr>
-      <w:r>
-        <w:t>The Journal of the American Statistical Association requires authors to make data accompanying their papers available to the scientific community except in cases where: 1) public sharing of data would be impossible, 2) suitable synthetic data are provided which allow the main analyses to be replicated (recognizing that results may differ from the "real" data analyses), and 3) the scientific value of the results and methods outweigh the lack of reproducibility.</w:t>
-      </w:r>
-    </w:p>
-  </w:comment>
-  <w:comment w:id="10" w:author="Author" w:initials="A">
-    <w:p>
-      <w:pPr>
-        <w:pStyle w:val="CommentText"/>
-      </w:pPr>
-      <w:r>
-        <w:rPr>
-          <w:rStyle w:val="CommentReference"/>
-        </w:rPr>
-        <w:annotationRef/>
-      </w:r>
-      <w:r>
-        <w:t>For example:</w:t>
-      </w:r>
-    </w:p>
-    <w:p>
-      <w:pPr>
-        <w:pStyle w:val="CommentText"/>
-        <w:numPr>
-          <w:ilvl w:val="0"/>
-          <w:numId w:val="1"/>
-        </w:numPr>
-      </w:pPr>
-      <w:r>
-        <w:t xml:space="preserve"> why data sharing is not possible,</w:t>
-      </w:r>
-    </w:p>
-    <w:p>
-      <w:pPr>
-        <w:pStyle w:val="CommentText"/>
-        <w:numPr>
-          <w:ilvl w:val="0"/>
-          <w:numId w:val="1"/>
-        </w:numPr>
-      </w:pPr>
-      <w:r>
-        <w:t xml:space="preserve"> what synthetic data are provided, </w:t>
-      </w:r>
-      <w:proofErr w:type="gramStart"/>
-      <w:r>
-        <w:t>and</w:t>
-      </w:r>
-      <w:proofErr w:type="gramEnd"/>
-      <w:r>
-        <w:t xml:space="preserve"> </w:t>
-      </w:r>
-    </w:p>
-    <w:p>
-      <w:pPr>
-        <w:pStyle w:val="CommentText"/>
-        <w:numPr>
-          <w:ilvl w:val="0"/>
-          <w:numId w:val="1"/>
-        </w:numPr>
-      </w:pPr>
-      <w:r>
-        <w:t xml:space="preserve"> why the value of the paper's scientific contribution outweighs the lack of reproducibility.</w:t>
-      </w:r>
-    </w:p>
-  </w:comment>
-  <w:comment w:id="13" w:author="Author" w:date="2020-04-25T15:22:00Z" w:initials="CP">
-    <w:p>
-      <w:pPr>
-        <w:pStyle w:val="CommentText"/>
-      </w:pPr>
-      <w:r>
-        <w:rPr>
-          <w:rStyle w:val="CommentReference"/>
-        </w:rPr>
-        <w:annotationRef/>
-      </w:r>
-      <w:r>
-        <w:t>Check all that apply.</w:t>
-      </w:r>
-    </w:p>
-  </w:comment>
-  <w:comment w:id="15" w:author="Author" w:date="2020-04-25T15:20:00Z" w:initials="CP">
-    <w:p>
-      <w:pPr>
-        <w:pStyle w:val="CommentText"/>
-      </w:pPr>
-      <w:r>
-        <w:rPr>
-          <w:rStyle w:val="CommentReference"/>
-        </w:rPr>
-        <w:annotationRef/>
-      </w:r>
-      <w:r>
-        <w:t>A data dictionary provides information that allows users to understand the meaning, format, and use of the data.</w:t>
-      </w:r>
-    </w:p>
-  </w:comment>
-  <w:comment w:id="16" w:author="Author" w:date="2020-04-25T15:36:00Z" w:initials="CP">
-    <w:p>
-      <w:pPr>
-        <w:pStyle w:val="CommentText"/>
-      </w:pPr>
-      <w:r>
-        <w:rPr>
-          <w:rStyle w:val="CommentReference"/>
-        </w:rPr>
-        <w:annotationRef/>
-      </w:r>
-      <w:r>
-        <w:t xml:space="preserve">Provide any details that would </w:t>
-      </w:r>
-      <w:proofErr w:type="gramStart"/>
-      <w:r>
-        <w:t>be helpful in understanding</w:t>
-      </w:r>
-      <w:proofErr w:type="gramEnd"/>
-      <w:r>
-        <w:t xml:space="preserve"> the data. If relevant, provide unique identifier/DOI/version information and/or license/terms of use.</w:t>
-      </w:r>
-    </w:p>
-  </w:comment>
-  <w:comment w:id="17" w:author="Author" w:initials="A">
-    <w:p>
-      <w:pPr>
-        <w:pStyle w:val="CommentText"/>
-      </w:pPr>
-      <w:r>
-        <w:rPr>
-          <w:rStyle w:val="CommentReference"/>
-        </w:rPr>
-        <w:annotationRef/>
-      </w:r>
-      <w:r>
-        <w:t>A short (</w:t>
-      </w:r>
-      <w:r>
-        <w:t>&lt; 1</w:t>
-      </w:r>
-      <w:r>
-        <w:t>00 words) description of the</w:t>
-      </w:r>
-      <w:r>
-        <w:t xml:space="preserve"> code. If necessary, more details can be provided in files that accompany the code.</w:t>
-      </w:r>
-      <w:r>
-        <w:t xml:space="preserve"> If no code is provided, please state </w:t>
-      </w:r>
-      <w:proofErr w:type="gramStart"/>
-      <w:r>
-        <w:t>this</w:t>
-      </w:r>
-      <w:proofErr w:type="gramEnd"/>
-      <w:r>
-        <w:t xml:space="preserve"> and say why (e.g., if the paper contains no computational work).</w:t>
-      </w:r>
-    </w:p>
-  </w:comment>
-  <w:comment w:id="19" w:author="Author" w:date="2020-04-25T15:22:00Z" w:initials="CP">
-    <w:p>
-      <w:pPr>
-        <w:pStyle w:val="CommentText"/>
-      </w:pPr>
-      <w:r>
-        <w:rPr>
-          <w:rStyle w:val="CommentReference"/>
-        </w:rPr>
-        <w:annotationRef/>
-      </w:r>
-      <w:r>
-        <w:t>Check all that apply.</w:t>
-      </w:r>
-    </w:p>
-  </w:comment>
-  <w:comment w:id="21" w:author="Author" w:date="2020-04-25T15:22:00Z" w:initials="CP">
-    <w:p>
-      <w:pPr>
-        <w:pStyle w:val="CommentText"/>
-      </w:pPr>
-      <w:r>
-        <w:rPr>
-          <w:rStyle w:val="CommentReference"/>
-        </w:rPr>
-        <w:annotationRef/>
-      </w:r>
-      <w:r>
-        <w:t>For example, R version 3.6.2.</w:t>
-      </w:r>
-    </w:p>
-  </w:comment>
-  <w:comment w:id="22" w:author="Author" w:date="2020-04-25T15:23:00Z" w:initials="CP">
-    <w:p>
-      <w:pPr>
-        <w:pStyle w:val="CommentText"/>
-      </w:pPr>
-      <w:r>
-        <w:rPr>
-          <w:rStyle w:val="CommentReference"/>
-        </w:rPr>
-        <w:annotationRef/>
-      </w:r>
-      <w:r>
-        <w:t>Include version numbers (e.g., version numbers for any R or Python packages used)</w:t>
-      </w:r>
-    </w:p>
-  </w:comment>
-  <w:comment w:id="23" w:author="Author" w:initials="A">
-    <w:p>
-      <w:pPr>
-        <w:rPr>
-          <w:sz w:val="20"/>
-          <w:szCs w:val="20"/>
-        </w:rPr>
-      </w:pPr>
-      <w:r>
-        <w:rPr>
-          <w:rStyle w:val="CommentReference"/>
-        </w:rPr>
-        <w:annotationRef/>
-      </w:r>
-      <w:r>
-        <w:rPr>
-          <w:sz w:val="20"/>
-          <w:szCs w:val="20"/>
-        </w:rPr>
-        <w:t>System/h</w:t>
-      </w:r>
-      <w:r>
-        <w:rPr>
-          <w:sz w:val="20"/>
-          <w:szCs w:val="20"/>
-        </w:rPr>
-        <w:t>ardware requirements including operating system with version number</w:t>
-      </w:r>
-      <w:r>
-        <w:rPr>
-          <w:sz w:val="20"/>
-          <w:szCs w:val="20"/>
-        </w:rPr>
-        <w:t>, access to cluster, GPUs, etc.</w:t>
-      </w:r>
-    </w:p>
-  </w:comment>
-  <w:comment w:id="26" w:author="Author" w:date="2020-04-25T15:24:00Z" w:initials="CP">
-    <w:p>
-      <w:pPr>
-        <w:pStyle w:val="CommentText"/>
-      </w:pPr>
-      <w:r>
-        <w:rPr>
-          <w:rStyle w:val="CommentReference"/>
-        </w:rPr>
-        <w:annotationRef/>
-      </w:r>
-      <w:r>
-        <w:t>By default, submitted code will be published on the JASA Github repository (https://github.com/jasa-acs) as well as in the supplementary material. Authors are encouraged to also make their code available in a public repository. If relevant, please provide unique identifier/DOI/version information here.</w:t>
-      </w:r>
-    </w:p>
-  </w:comment>
-  <w:comment w:id="27" w:author="Author" w:date="2020-04-25T15:26:00Z" w:initials="CP">
-    <w:p>
-      <w:pPr>
-        <w:pStyle w:val="CommentText"/>
-      </w:pPr>
-      <w:r>
-        <w:rPr>
-          <w:rStyle w:val="CommentReference"/>
-        </w:rPr>
-        <w:annotationRef/>
-      </w:r>
-      <w:r>
-        <w:t>The materials provided should provide a straightforward way for reviewers and readers to reproduce analyses with as few steps as possible.</w:t>
-      </w:r>
-    </w:p>
-  </w:comment>
-  <w:comment w:id="30" w:author="Author" w:date="2020-04-25T15:26:00Z" w:initials="CP">
-    <w:p>
-      <w:pPr>
-        <w:pStyle w:val="CommentText"/>
-      </w:pPr>
-      <w:r>
-        <w:rPr>
-          <w:rStyle w:val="CommentReference"/>
-        </w:rPr>
-        <w:annotationRef/>
-      </w:r>
-      <w:r>
-        <w:t>Check all that apply</w:t>
-      </w:r>
-    </w:p>
-  </w:comment>
-  <w:comment w:id="32" w:author="Author" w:initials="A">
-    <w:p>
-      <w:pPr>
-        <w:pStyle w:val="CommentText"/>
-      </w:pPr>
-      <w:r>
-        <w:rPr>
-          <w:rStyle w:val="CommentReference"/>
-        </w:rPr>
-        <w:annotationRef/>
-      </w:r>
-      <w:r>
-        <w:t>Describe how to use the materials provided to reproduce analyses in the manuscript</w:t>
-      </w:r>
-      <w:r>
-        <w:t>.</w:t>
-      </w:r>
-      <w:r>
-        <w:t xml:space="preserve"> Additional details can be provided in file(s) accompanying the reproducibility materials.</w:t>
-      </w:r>
-      <w:r>
-        <w:t xml:space="preserve"> If no workflow is provided, please state </w:t>
-      </w:r>
-      <w:proofErr w:type="gramStart"/>
-      <w:r>
-        <w:t>this</w:t>
-      </w:r>
-      <w:proofErr w:type="gramEnd"/>
-      <w:r>
-        <w:t xml:space="preserve"> and say why (e.g., if the paper contains no computational work).</w:t>
-      </w:r>
-    </w:p>
-  </w:comment>
-  <w:comment w:id="33" w:author="Author" w:initials="A">
-    <w:p>
-      <w:pPr>
-        <w:pStyle w:val="CommentText"/>
-      </w:pPr>
-      <w:r>
-        <w:rPr>
-          <w:rStyle w:val="CommentReference"/>
-        </w:rPr>
-        <w:annotationRef/>
-      </w:r>
-      <w:r>
-        <w:t xml:space="preserve">Additional documentation provided (e.g., R package vignettes, </w:t>
-      </w:r>
-      <w:proofErr w:type="gramStart"/>
-      <w:r>
-        <w:t>demos</w:t>
-      </w:r>
-      <w:proofErr w:type="gramEnd"/>
-      <w:r>
-        <w:t xml:space="preserve"> or other examples) that show how to use the provided code/software in other settings</w:t>
-      </w:r>
-      <w:r>
-        <w:t>.</w:t>
-      </w:r>
-    </w:p>
-  </w:comment>
-  <w:comment w:id="35" w:author="Author" w:initials="A">
-    <w:p>
-      <w:pPr>
-        <w:pStyle w:val="CommentText"/>
-      </w:pPr>
-      <w:r>
-        <w:rPr>
-          <w:rStyle w:val="CommentReference"/>
-        </w:rPr>
-        <w:annotationRef/>
-      </w:r>
-      <w:r>
-        <w:t>Any other relevant information not covered on this form</w:t>
-      </w:r>
-      <w:r>
-        <w:t>.</w:t>
-      </w:r>
-      <w:r>
-        <w:t xml:space="preserve"> If reproducibility materials are not publicly available at the time of submission, please provide information here on how the reviewers can view the materials (and make sure to remove this information when submitting the final version of this form for an accepted manuscript).</w:t>
-      </w:r>
-    </w:p>
-  </w:comment>
-</w:comments>
-</file>
-
-<file path=word/commentsExtended.xml><?xml version="1.0" encoding="utf-8"?>
-<w15:commentsEx xmlns:wpc="http://schemas.microsoft.com/office/word/2010/wordprocessingCanvas" xmlns:cx="http://schemas.microsoft.com/office/drawing/2014/chartex" xmlns:cx1="http://schemas.microsoft.com/office/drawing/2015/9/8/chartex" xmlns:cx2="http://schemas.microsoft.com/office/drawing/2015/10/21/chartex" xmlns:cx3="http://schemas.microsoft.com/office/drawing/2016/5/9/chartex" xmlns:cx4="http://schemas.microsoft.com/office/drawing/2016/5/10/chartex" xmlns:cx5="http://schemas.microsoft.com/office/drawing/2016/5/11/chartex" xmlns:cx6="http://schemas.microsoft.com/office/drawing/2016/5/12/chartex" xmlns:cx7="http://schemas.microsoft.com/office/drawing/2016/5/13/chartex" xmlns:cx8="http://schemas.microsoft.com/office/drawing/2016/5/14/chartex" xmlns:mc="http://schemas.openxmlformats.org/markup-compatibility/2006" xmlns:aink="http://schemas.microsoft.com/office/drawing/2016/ink" xmlns:am3d="http://schemas.microsoft.com/office/drawing/2017/model3d" xmlns:o="urn:schemas-microsoft-com:office:office" xmlns:r="http://schemas.openxmlformats.org/officeDocument/2006/relationships" xmlns:m="http://schemas.openxmlformats.org/officeDocument/2006/math" xmlns:v="urn:schemas-microsoft-com:vml" xmlns:wp14="http://schemas.microsoft.com/office/word/2010/wordprocessingDrawing" xmlns:wp="http://schemas.openxmlformats.org/drawingml/2006/wordprocessingDrawing" xmlns:w10="urn:schemas-microsoft-com:office:word" xmlns:w="http://schemas.openxmlformats.org/wordprocessingml/2006/main" xmlns:w14="http://schemas.microsoft.com/office/word/2010/wordml" xmlns:w15="http://schemas.microsoft.com/office/word/2012/wordml" xmlns:w16cex="http://schemas.microsoft.com/office/word/2018/wordml/cex" xmlns:w16cid="http://schemas.microsoft.com/office/word/2016/wordml/cid" xmlns:w16="http://schemas.microsoft.com/office/word/2018/wordml" xmlns:w16sdtdh="http://schemas.microsoft.com/office/word/2020/wordml/sdtdatahash" xmlns:w16se="http://schemas.microsoft.com/office/word/2015/wordml/symex" xmlns:wpg="http://schemas.microsoft.com/office/word/2010/wordprocessingGroup" xmlns:wpi="http://schemas.microsoft.com/office/word/2010/wordprocessingInk" xmlns:wne="http://schemas.microsoft.com/office/word/2006/wordml" xmlns:wps="http://schemas.microsoft.com/office/word/2010/wordprocessingShape" mc:Ignorable="w14 w15 w16se w16cid w16 w16cex w16sdtdh wp14">
-  <w15:commentEx w15:paraId="3C843FD7" w15:done="0"/>
-  <w15:commentEx w15:paraId="0444695B" w15:done="0"/>
-  <w15:commentEx w15:paraId="4F8A765D" w15:done="0"/>
-  <w15:commentEx w15:paraId="1BF4231B" w15:done="0"/>
-  <w15:commentEx w15:paraId="0C5D3C17" w15:done="0"/>
-  <w15:commentEx w15:paraId="4B937DAE" w15:done="0"/>
-  <w15:commentEx w15:paraId="2C5C6CAC" w15:done="0"/>
-  <w15:commentEx w15:paraId="17F30D65" w15:done="0"/>
-  <w15:commentEx w15:paraId="096EC5CE" w15:done="0"/>
-  <w15:commentEx w15:paraId="5CB50FFF" w15:done="0"/>
-  <w15:commentEx w15:paraId="2FF089D9" w15:done="0"/>
-  <w15:commentEx w15:paraId="0BE0B11C" w15:done="0"/>
-  <w15:commentEx w15:paraId="26A43973" w15:done="0"/>
-  <w15:commentEx w15:paraId="3E9EE990" w15:done="0"/>
-  <w15:commentEx w15:paraId="5388EA45" w15:done="0"/>
-  <w15:commentEx w15:paraId="59F0F3F3" w15:done="0"/>
-  <w15:commentEx w15:paraId="02BE8CD2" w15:done="0"/>
-  <w15:commentEx w15:paraId="23177F7F" w15:done="0"/>
-  <w15:commentEx w15:paraId="3EBDB957" w15:done="0"/>
-  <w15:commentEx w15:paraId="0F7C1E24" w15:done="0"/>
-</w15:commentsEx>
-</file>
-
-<file path=word/commentsIds.xml><?xml version="1.0" encoding="utf-8"?>
-<w16cid:commentsIds xmlns:wpc="http://schemas.microsoft.com/office/word/2010/wordprocessingCanvas" xmlns:cx="http://schemas.microsoft.com/office/drawing/2014/chartex" xmlns:cx1="http://schemas.microsoft.com/office/drawing/2015/9/8/chartex" xmlns:cx2="http://schemas.microsoft.com/office/drawing/2015/10/21/chartex" xmlns:cx3="http://schemas.microsoft.com/office/drawing/2016/5/9/chartex" xmlns:cx4="http://schemas.microsoft.com/office/drawing/2016/5/10/chartex" xmlns:cx5="http://schemas.microsoft.com/office/drawing/2016/5/11/chartex" xmlns:cx6="http://schemas.microsoft.com/office/drawing/2016/5/12/chartex" xmlns:cx7="http://schemas.microsoft.com/office/drawing/2016/5/13/chartex" xmlns:cx8="http://schemas.microsoft.com/office/drawing/2016/5/14/chartex" xmlns:mc="http://schemas.openxmlformats.org/markup-compatibility/2006" xmlns:aink="http://schemas.microsoft.com/office/drawing/2016/ink" xmlns:am3d="http://schemas.microsoft.com/office/drawing/2017/model3d" xmlns:o="urn:schemas-microsoft-com:office:office" xmlns:r="http://schemas.openxmlformats.org/officeDocument/2006/relationships" xmlns:m="http://schemas.openxmlformats.org/officeDocument/2006/math" xmlns:v="urn:schemas-microsoft-com:vml" xmlns:wp14="http://schemas.microsoft.com/office/word/2010/wordprocessingDrawing" xmlns:wp="http://schemas.openxmlformats.org/drawingml/2006/wordprocessingDrawing" xmlns:w10="urn:schemas-microsoft-com:office:word" xmlns:w="http://schemas.openxmlformats.org/wordprocessingml/2006/main" xmlns:w14="http://schemas.microsoft.com/office/word/2010/wordml" xmlns:w15="http://schemas.microsoft.com/office/word/2012/wordml" xmlns:w16cex="http://schemas.microsoft.com/office/word/2018/wordml/cex" xmlns:w16cid="http://schemas.microsoft.com/office/word/2016/wordml/cid" xmlns:w16="http://schemas.microsoft.com/office/word/2018/wordml" xmlns:w16sdtdh="http://schemas.microsoft.com/office/word/2020/wordml/sdtdatahash" xmlns:w16se="http://schemas.microsoft.com/office/word/2015/wordml/symex" xmlns:wpg="http://schemas.microsoft.com/office/word/2010/wordprocessingGroup" xmlns:wpi="http://schemas.microsoft.com/office/word/2010/wordprocessingInk" xmlns:wne="http://schemas.microsoft.com/office/word/2006/wordml" xmlns:wps="http://schemas.microsoft.com/office/word/2010/wordprocessingShape" mc:Ignorable="w14 w15 w16se w16cid w16 w16cex w16sdtdh wp14">
-  <w16cid:commentId w16cid:paraId="3C843FD7" w16cid:durableId="224EB8A1"/>
-  <w16cid:commentId w16cid:paraId="0444695B" w16cid:durableId="224EB8A2"/>
-  <w16cid:commentId w16cid:paraId="4F8A765D" w16cid:durableId="224EB8A3"/>
-  <w16cid:commentId w16cid:paraId="1BF4231B" w16cid:durableId="2250745D"/>
-  <w16cid:commentId w16cid:paraId="0C5D3C17" w16cid:durableId="224EB8A5"/>
-  <w16cid:commentId w16cid:paraId="4B937DAE" w16cid:durableId="224EB8A6"/>
-  <w16cid:commentId w16cid:paraId="2C5C6CAC" w16cid:durableId="224ED420"/>
-  <w16cid:commentId w16cid:paraId="17F30D65" w16cid:durableId="224ED3CA"/>
-  <w16cid:commentId w16cid:paraId="096EC5CE" w16cid:durableId="224ED765"/>
-  <w16cid:commentId w16cid:paraId="5CB50FFF" w16cid:durableId="224ED045"/>
-  <w16cid:commentId w16cid:paraId="2FF089D9" w16cid:durableId="224ED43A"/>
-  <w16cid:commentId w16cid:paraId="0BE0B11C" w16cid:durableId="224ED44C"/>
-  <w16cid:commentId w16cid:paraId="26A43973" w16cid:durableId="224ED45E"/>
-  <w16cid:commentId w16cid:paraId="3E9EE990" w16cid:durableId="224EB8A8"/>
-  <w16cid:commentId w16cid:paraId="5388EA45" w16cid:durableId="224ED4BE"/>
-  <w16cid:commentId w16cid:paraId="59F0F3F3" w16cid:durableId="224ED519"/>
-  <w16cid:commentId w16cid:paraId="02BE8CD2" w16cid:durableId="224ED540"/>
-  <w16cid:commentId w16cid:paraId="23177F7F" w16cid:durableId="224EB8A9"/>
-  <w16cid:commentId w16cid:paraId="3EBDB957" w16cid:durableId="224EB8AB"/>
-  <w16cid:commentId w16cid:paraId="0F7C1E24" w16cid:durableId="224EB8AC"/>
-</w16cid:commentsIds>
 </file>
 
 <file path=word/endnotes.xml><?xml version="1.0" encoding="utf-8"?>

</xml_diff>